<commit_message>
v3.1.0: verified references (three unverifiable entries removed), repaired figure script, 801 quantiles for the capsule population
Co-Authored-By: Claude Sonnet 5.5 <noreply@anthropic.com>
</commit_message>
<xml_diff>
--- a/manuscript/AutoLatch_ChemRxiv_WileyMTS_Manuscript_v3.docx
+++ b/manuscript/AutoLatch_ChemRxiv_WileyMTS_Manuscript_v3.docx
@@ -220,7 +220,7 @@
         <w:rPr>
           <w:lang w:val="en-US"/>
         </w:rPr>
-        <w:t>The delayed transformation of a reactive material into a solid phase is limited, in most thermal-management approaches, by a basic trade-off between transport stability and transformation speed. We formulate and computationally analyze a coupled zero-dimensional model in which (i) a lumped thermal energy balance governs the fluid element's temperature, including exothermic self-heating from the reaction itself; (ii) the release of a reaction-triggering species follows a physically motivated first-order relaxation toward a temperature dependent, Arrhenius-rate-controlled saturation level (a lumped analog to shell-diffusion-limited release), rather than a prescribed availability function; and (iii) the triggered reaction follows Kamal–Sourour autocatalytic kinetics. Four dimensionless groups — Λ=0.911 (release-to-reaction timescale ratio), Θ=0.454 (thermal-to-reaction timescale ratio), ψ=10.08 (reduced exothermicity), and Ar=18.9 (activation-sensitivity number) — are used to organize the parameter space. An objectively matched (not arbitrarily scaled) comparison against a first-order control, whose rate constant is root-solved for equal t50 rather than assigned an assumed scaling factor, shows that the coupled autocatalytic system is Pareto-optimal: across 60 sampled first-order rate constants spanning a wide range, none simultaneously matches or beats the coupled system on both premature conversion (α at t=25 min) and completion time (t90). A two-parameter regime map over (Θ, Λ) identifies thermally limited, release-limited, and reaction-limited regions, with the thermally limited region driving peak exothermic overshoots up to 204°C above the setpoint. Because complete suppression of conversion below the nominal activation threshold is a structural consequence of the idealized (zero-width) gate rather than an independent prediction, we reframe the falsifiable claim around a finite-width thermal gate: increasing the gate width from 0.5°C to 15°C is predicted to reduce premature conversion (α at t=25 min falling from 0.073 to 0.039) at the cost of slower completion (t90 rising from 34.1 to 40.4 min) — a quantified, directly testable trade-off. Vectorized Monte Carlo propagation of joint uncertainty across nine kinetic, release, and thermal parameters (N=20,000) indicates that 69.9% of the draws satisfy both a minimum induction time and a 75-minute completion target, with reaction-kinetics parameters (most notably Ea2, Spearman r=0.69) dominating the predicted variance over thermal or release-timescale parameters. Four extensions then test whether these conclusions survive stronger scrutiny. (i) A capsule population with a spread σ of melting temperature reproduces the finite gate width without postulating it (w_eff ≈ 0.55σ, agreeing with the population model within about 21 %), so that the leakage prediction acquires a measurable input, the width of the DSC melting endotherm. (ii) With a storage-stability objective that the first version did not measure, and Arrhenius controls that share the energy balance, none of 547 tuned designs of four other mechanisms dominates the coupled system on all three objectives; 9 of 200 detuned designs of the coupled family itself do, so the reference operating point is illustrative, not optimal. (iii) A design rule gives the largest admissible melting-point spread (σ ≈ 6 °C for ≤ 1 % storage conversion at a 6 °C margin). (iv) Variance-based (Sobol) indices confirm that Ea2 dominates the completion time (total-order index 0.76). Five falsifiable predictions, each paired with a standard dynamic-DSC or rheo-DSC validation protocol, are stated for future experimental testing.</w:t>
+        <w:t>The delayed transformation of a reactive material into a solid phase is limited, in most thermal-management approaches, by a basic trade-off between transport stability and transformation speed. We formulate and computationally analyze a coupled zero-dimensional model in which (i) a lumped thermal energy balance governs the fluid element's temperature, including exothermic self-heating from the reaction itself; (ii) the release of a reaction-triggering species follows a physically motivated first-order relaxation toward a temperature dependent, Arrhenius-rate-controlled saturation level (a lumped analog to shell-diffusion-limited release), rather than a prescribed availability function; and (iii) the triggered reaction follows Kamal–Sourour autocatalytic kinetics. Four dimensionless groups — Λ=0.911 (release-to-reaction timescale ratio), Θ=0.454 (thermal-to-reaction timescale ratio), ψ=10.08 (reduced exothermicity), and Ar=18.9 (activation-sensitivity number) — are used to organize the parameter space. An objectively matched (not arbitrarily scaled) comparison against a first-order control, whose rate constant is root-solved for equal t50 rather than assigned an assumed scaling factor, shows that the coupled autocatalytic system is Pareto-optimal: across 60 sampled first-order rate constants spanning a wide range, none simultaneously matches or beats the coupled system on both premature conversion (α at t=25 min) and completion time (t90). A two-parameter regime map over (Θ, Λ) identifies thermally limited, release-limited, and reaction-limited regions, with the thermally limited region driving peak exothermic overshoots up to 204°C above the setpoint. Because complete suppression of conversion below the nominal activation threshold is a structural consequence of the idealized (zero-width) gate rather than an independent prediction, we reframe the falsifiable claim around a finite-width thermal gate: increasing the gate width from 0.5°C to 15°C is predicted to reduce premature conversion (α at t=25 min falling from 0.073 to 0.039) at the cost of slower completion (t90 rising from 34.1 to 40.4 min) — a quantified, directly testable trade-off. Vectorized Monte Carlo propagation of joint uncertainty across nine kinetic, release, and thermal parameters (N=20,000) indicates that 69.9% of the draws satisfy both a minimum induction time and a 75-minute completion target, with reaction-kinetics parameters (most notably Ea2, Spearman r=0.69) dominating the predicted variance over thermal or release-timescale parameters. Four extensions then test whether these conclusions survive stronger scrutiny. (i) A capsule population with a spread σ of melting temperature reproduces the finite gate width without postulating it (w_eff ≈ 0.55σ, agreeing with the population model within about 20 %), so that the leakage prediction acquires a measurable input, the width of the DSC melting endotherm. (ii) With a storage-stability objective that the first version did not measure, and Arrhenius controls that share the energy balance, none of 547 tuned designs of four other mechanisms dominates the coupled system on all three objectives; 9 of 200 detuned designs of the coupled family itself do, so the reference operating point is illustrative, not optimal. (iii) A design rule gives the largest admissible melting-point spread (σ ≈ 6 °C for ≤ 1 % storage conversion at a 6 °C margin). (iv) Variance-based (Sobol) indices confirm that Ea2 dominates the completion time (total-order index 0.76). Five falsifiable predictions, each paired with a standard dynamic-DSC or rheo-DSC validation protocol, are stated for future experimental testing.</w:t>
       </w:r>
     </w:p>
     <w:p>
@@ -246,7 +246,7 @@
         <w:rPr>
           <w:lang w:val="en-US"/>
         </w:rPr>
-        <w:t>Controlling when and how quickly a reactive material transforms into a solid phase is a recurring problem in thermal management: thermal energy storage systems, adaptive-rheology fluids, microfluidic thermal switches, and self-healing or set-on-demand materials all require a material that remains stable under one set of thermal conditions and then transforms predictably under another.</w:t>
+        <w:t>Controlling when and how quickly a reactive material transforms into a solid phase is a recurring problem in thermal management: thermal energy storage systems, adaptive-rheology fluids, microfluidic thermal switches, and self-healing or set-on-demand materials [5, 6] all require a material that remains stable under one set of thermal conditions and then transforms predictably under another.</w:t>
       </w:r>
     </w:p>
     <w:p>
@@ -504,7 +504,7 @@
         <w:rPr>
           <w:lang w:val="en-US"/>
         </w:rPr>
-        <w:t>[Established form, Kamal &amp; Sourour 1973]:</w:t>
+        <w:t>[Established form, Kamal &amp; Sourour 1973 [1, 2]]:</w:t>
       </w:r>
     </w:p>
     <w:p>
@@ -624,7 +624,7 @@
         <w:rPr>
           <w:lang w:val="en-US"/>
         </w:rPr>
-        <w:t>ψ = ΔT_ad·Ea₂/(RT_ref²) — reduced exothermicity/heat-release number (the standard activation-weighted heat-release group from thermal-explosion theory, e.g., Frank-Kamenetskii/Semenov-type analyses — used here descriptively via direct simulation, §4.5, not via an asserted closed-form critical value, since the lumped geometry here differs from the classical slab/sphere treatments)</w:t>
+        <w:t>ψ = ΔT_ad·Ea₂/(RT_ref²) — reduced exothermicity/heat-release number (the standard activation-weighted heat-release group from thermal-explosion theory, e.g., Frank-Kamenetskii/Semenov-type analyses [3, 4] — used here descriptively via direct simulation, §4.5, not via an asserted closed-form critical value, since the lumped geometry here differs from the classical slab/sphere treatments)</w:t>
       </w:r>
     </w:p>
     <w:p>
@@ -3717,7 +3717,7 @@
         <w:rPr>
           <w:lang w:val="en-US"/>
         </w:rPr>
-        <w:t>Section 4.6 postulated a logistic gate of width w. A real capsule population has no such function; it has a distribution of melting temperatures (shell thickness, wax grade, capsule size) and possibly of release times. The gate is therefore re-derived as a population: K = 61 capsules with melting temperatures T_melt + σ·z_i, where the z_i are deterministic Gaussian quantiles, each with a near-step gate (w0 = 0.5 °C) and its own release relaxation; the reaction is driven by the capsule-averaged availability C̄ = (1/K)ΣC_i. Matching the variance of a logistic and of a Gaussian distribution gives w_eff = (w0² + 3σ²/π²)^½, i.e. w_eff ≈ 0.55σ for σ ≫ w0.</w:t>
+        <w:t>Section 4.6 postulated a logistic gate of width w. A real capsule population has no such function; it has a distribution of melting temperatures (shell thickness, wax grade, capsule size) and possibly of release times. The gate is therefore re-derived as a population: K = 801 capsules with melting temperatures T_melt + σ·z_i, where the z_i are deterministic Gaussian quantiles, each with a near-step gate (w0 = 0.5 °C) and its own release relaxation; the reaction is driven by the capsule-averaged availability C̄ = (1/K)ΣC_i. Matching the variance of a logistic and of a Gaussian distribution gives w_eff = (w0² + 3σ²/π²)^½, i.e. w_eff ≈ 0.55σ for σ ≫ w0.</w:t>
       </w:r>
     </w:p>
     <w:p>
@@ -3787,7 +3787,7 @@
         <w:rPr>
           <w:lang w:val="en-US"/>
         </w:rPr>
-        <w:t>The population model confirms this where it can be tested (Figure 8b). The single-gate width that reproduces the storage conversion of the population is 0.59, 0.96, 2.34, 3.63 °C for σ = 1, 2, 4 and 6 °C, against 0.74, 1.21, 2.26, 3.35 °C from the variance argument; the two differ by at most 21 % over σ = 1–6 °C and by 3–9 % for σ ≥ 4 °C, the residual reflecting the release lag, which the variance argument ignores. At the operating temperature the behaviour is almost insensitive to σ: α at 25 min stays between 0.072 and 0.073 and t90 between 34.1 and 34.2 min for σ = 0–6 °C, whereas the storage conversion at 112 °C rises from 0 to 0.0096 (Figure 8a). A lognormal scatter of the release time constant (coefficient of variation up to 1) changes α at 25 min from 0.073 to 0.084 and t90 from 34.1 to 33.7 min. Under the present model, therefore, the spread of melting temperature, not of release time, controls storage stability. This turns the leakage prediction of Section 4.6 into a relation between two measurable quantities (Prediction 4, Section 7): the standard deviation σ of the melting-temperature distribution, estimated from the DSC melting endotherm, and the storage conversion.</w:t>
+        <w:t>The population model confirms this where it can be tested (Figure 8b). The single-gate width that reproduces the storage conversion of the population is 0.60, 1.05, 2.34, 3.63 °C for σ = 1, 2, 4 and 6 °C, against 0.74, 1.21, 2.26, 3.35 °C from the variance argument; the two differ by at most 20 % over σ = 1–6 °C and by 3–9 % for σ ≥ 4 °C, the residual reflecting the release lag, which the variance argument ignores. At the operating temperature the behaviour is almost insensitive to σ: α at 25 min stays between 0.072 and 0.073 and t90 between 34.1 and 34.2 min for σ = 0–6 °C, whereas the storage conversion at 112 °C rises from 0 to 0.0096 (Figure 8a). A lognormal scatter of the release time constant (coefficient of variation up to 1) changes α at 25 min from 0.073 to 0.084 and t90 from 34.1 to 33.7 min. Under the present model, therefore, the spread of melting temperature, not of release time, controls storage stability. This turns the leakage prediction of Section 4.6 into a relation between two measurable quantities (Prediction 4, Section 7): the standard deviation σ of the melting-temperature distribution, estimated from the DSC melting endotherm, and the storage conversion.</w:t>
       </w:r>
     </w:p>
     <w:p>
@@ -3919,7 +3919,7 @@
       <w:r>
         <w:drawing>
           <wp:inline xmlns:a="http://schemas.openxmlformats.org/drawingml/2006/main">
-            <wp:extent cx="5760720" cy="2173476"/>
+            <wp:extent cx="5760720" cy="2164154"/>
             <wp:docPr id="12" name="Picture 12"/>
             <wp:cNvGraphicFramePr>
               <a:graphicFrameLocks noChangeAspect="1"/>
@@ -3940,7 +3940,7 @@
                   <pic:spPr>
                     <a:xfrm>
                       <a:off x="0" y="0"/>
-                      <a:ext cx="5760720" cy="2173476"/>
+                      <a:ext cx="5760720" cy="2164154"/>
                     </a:xfrm>
                     <a:prstGeom prst="rect"/>
                   </pic:spPr>
@@ -4169,7 +4169,7 @@
                 <w:b w:val="0"/>
                 <w:sz w:val="18"/>
               </w:rPr>
-              <w:t>1.18</w:t>
+              <w:t>1.16</w:t>
             </w:r>
           </w:p>
         </w:tc>
@@ -4427,7 +4427,7 @@
                 <w:b w:val="0"/>
                 <w:sz w:val="18"/>
               </w:rPr>
-              <w:t>2.90</w:t>
+              <w:t>2.91</w:t>
             </w:r>
           </w:p>
         </w:tc>
@@ -5981,7 +5981,7 @@
         <w:rPr>
           <w:lang w:val="en-US"/>
         </w:rPr>
-        <w:t>The population model (Section 4.8) assumes K = 61 independent capsules of equal mass with a Gaussian spread of melting temperatures and no heat or mass exchange between capsules; skewed or bimodal distributions would change the relation between σ and w_eff.</w:t>
+        <w:t>The population model (Section 4.8) assumes K = 801 independent capsules of equal mass with a Gaussian spread of melting temperatures and no heat or mass exchange between capsules; skewed or bimodal distributions would change the relation between σ and w_eff.</w:t>
       </w:r>
     </w:p>
     <w:p>
@@ -6278,7 +6278,7 @@
         <w:rPr>
           <w:lang w:val="en-US"/>
         </w:rPr>
-        <w:t>The complete integration, sweep, Monte Carlo, and figure-generation code is provided as open-source software at https://github.com/sandlerleon/autolatch-thermal-gating (MIT license) and archived with a permanent, version-tracking concept DOI on Zenodo: https://doi.org/10.5281/zenodo.22073392 (always resolves to the latest code version). The manuscript itself is additionally archived as a preprint on Zenodo: https://doi.org/10.5281/zenodo.22073390 (concept DOI, always resolves to the latest version), and posted to ChemRxiv: https://doi.org/10.26434/chemrxiv.15008366/v1. The present version (v3) is archived as Zenodo software version https://doi.org/10.5281/zenodo.23201204 and manuscript version https://doi.org/10.5281/zenodo.23201205; the concept DOIs above resolve to the latest versions.</w:t>
+        <w:t>The complete integration, sweep, Monte Carlo, and figure-generation code is provided as open-source software at https://github.com/sandlerleon/autolatch-thermal-gating (MIT license) and archived with a permanent, version-tracking concept DOI on Zenodo: https://doi.org/10.5281/zenodo.22073392 (always resolves to the latest code version). The manuscript itself is additionally archived as a preprint on Zenodo: https://doi.org/10.5281/zenodo.22073390 (concept DOI, always resolves to the latest version), and posted to ChemRxiv: https://doi.org/10.26434/chemrxiv.15008366/v1. The present version (v3) is archived as Zenodo software version https://doi.org/10.5281/zenodo.23202124 and manuscript version https://doi.org/10.5281/zenodo.23202125; the concept DOIs above resolve to the latest versions.</w:t>
       </w:r>
       <w:hyperlink r:id="rId11">
         <w:r>
@@ -6340,7 +6340,7 @@
         <w:rPr>
           <w:lang w:val="en-US"/>
         </w:rPr>
-        <w:t>Kamal, M. R.; Sourour, S. Kinetics and thermal characterization of thermoset cure. Polymer Engineering &amp; Science 1973, 13(1), 59–64.</w:t>
+        <w:t>[1] Kamal, M. R.; Sourour, S. Kinetics and thermal characterization of thermoset cure. Polymer Engineering &amp; Science 1973, 13(1), 59–64. https://doi.org/10.1002/pen.760130110</w:t>
       </w:r>
     </w:p>
     <w:p>
@@ -6353,7 +6353,7 @@
         <w:rPr>
           <w:lang w:val="en-US"/>
         </w:rPr>
-        <w:t>Bashir, M. A. A review on epoxy resin curing kinetics and thermal analysis. Polymers 2023, 15(15), 3251.</w:t>
+        <w:t>[2] Sourour, S.; Kamal, M. R. Differential scanning calorimetry of epoxy cure: isothermal cure kinetics. Thermochimica Acta 1976, 14, 41–59. https://doi.org/10.1016/0040-6031(76)80056-1</w:t>
       </w:r>
     </w:p>
     <w:p>
@@ -6366,7 +6366,7 @@
         <w:rPr>
           <w:lang w:val="en-US"/>
         </w:rPr>
-        <w:t>Ryshkewitch, E. Compression strength of porous sintered alumina and zirconia. Journal of the American Ceramic Society 1953, 36(2), 65–68.</w:t>
+        <w:t>[3] Semenoff, N. Zur Theorie des Verbrennungsprozesses. Zeitschrift für Physik 1928, 48, 571–582. https://doi.org/10.1007/bf01340021</w:t>
       </w:r>
     </w:p>
     <w:p>
@@ -6379,7 +6379,7 @@
         <w:rPr>
           <w:lang w:val="en-US"/>
         </w:rPr>
-        <w:t>Zhang, X. et al. Microencapsulated phase-change materials for thermal energy storage: a review. Applied Thermal Engineering 2020, 165, 114567.</w:t>
+        <w:t>[4] Frank-Kamenetskii, D. A. Diffusion and Heat Transfer in Chemical Kinetics, 2nd ed.; Plenum Press: New York, 1969.</w:t>
       </w:r>
     </w:p>
     <w:p>
@@ -6392,7 +6392,20 @@
         <w:rPr>
           <w:lang w:val="en-US"/>
         </w:rPr>
-        <w:t>Gou, J. et al. Encapsulation and thermally triggered release of catalytic agents in curable resins: a review. Progress in Polymer Science 2021, 112, 101324.</w:t>
+        <w:t>[5] White, S. R.; Sottos, N. R.; Geubelle, P. H.; Moore, J. S.; Kessler, M. R.; Sriram, S. R.; Brown, E. N.; Viswanathan, S. Autonomic healing of polymer composites. Nature 2001, 409, 794–797. https://doi.org/10.1038/35057232</w:t>
+      </w:r>
+    </w:p>
+    <w:p>
+      <w:pPr>
+        <w:pStyle w:val="Normal"/>
+        <w:spacing w:before="0" w:after="160"/>
+        <w:rPr/>
+      </w:pPr>
+      <w:r>
+        <w:rPr>
+          <w:lang w:val="en-US"/>
+        </w:rPr>
+        <w:t>[6] Jamekhorshid, A.; Sadrameli, S. M.; Farid, M. A review of microencapsulation methods of phase change materials (PCMs) as a thermal energy storage (TES) medium. Renewable and Sustainable Energy Reviews 2014, 31, 531–542. https://doi.org/10.1016/j.rser.2013.12.033</w:t>
       </w:r>
     </w:p>
     <w:sectPr>

</xml_diff>